<commit_message>
Update password hashing documentation to clarify input/output data principles and enhance explanation of Bcrypt, Scrypt, and Argon2id algorithms. Revise README to reflect changes in focus on hashing methods.
</commit_message>
<xml_diff>
--- a/BAOCAO.docx
+++ b/BAOCAO.docx
@@ -15,8 +15,8 @@
       </w:pPr>
       <w:bookmarkStart w:id="0" w:name="_Toc444705653"/>
       <w:bookmarkStart w:id="1" w:name="_Toc445462293"/>
-      <w:bookmarkStart w:id="2" w:name="_Toc445461334"/>
-      <w:bookmarkStart w:id="3" w:name="_Toc445461542"/>
+      <w:bookmarkStart w:id="2" w:name="_Toc445461542"/>
+      <w:bookmarkStart w:id="3" w:name="_Toc445461334"/>
       <w:bookmarkStart w:id="4" w:name="_Toc345163084"/>
       <w:bookmarkStart w:id="5" w:name="_Toc400832646"/>
       <w:r>
@@ -11671,8 +11671,6 @@
           <w:tab w:val="clear" w:pos="9062"/>
         </w:tabs>
       </w:pPr>
-      <w:bookmarkStart w:id="108" w:name="_GoBack"/>
-      <w:bookmarkEnd w:id="108"/>
       <w:r>
         <w:rPr>
           <w:rFonts w:hint="default"/>
@@ -14919,49 +14917,332 @@
         </w:tc>
       </w:tr>
     </w:tbl>
-    <w:p>
-      <w:pPr>
-        <w:bidi w:val="0"/>
-        <w:rPr>
-          <w:rFonts w:hint="default"/>
-        </w:rPr>
-      </w:pPr>
-    </w:p>
-    <w:p>
-      <w:pPr>
-        <w:rPr>
-          <w:rFonts w:hint="default"/>
-          <w:lang w:val="vi-VN"/>
-        </w:rPr>
-      </w:pPr>
-    </w:p>
-    <w:p>
-      <w:pPr>
-        <w:rPr>
-          <w:rFonts w:hint="default"/>
-        </w:rPr>
-      </w:pPr>
-    </w:p>
-    <w:p>
-      <w:pPr>
-        <w:spacing w:after="0" w:line="240" w:lineRule="auto"/>
-        <w:jc w:val="left"/>
-        <w:rPr>
-          <w:rFonts w:eastAsia="Times New Roman"/>
-        </w:rPr>
-      </w:pPr>
-    </w:p>
-    <w:p>
-      <w:pPr>
-        <w:spacing w:after="0" w:line="240" w:lineRule="auto"/>
-        <w:jc w:val="left"/>
-        <w:rPr>
-          <w:rFonts w:eastAsia="Times New Roman"/>
-        </w:rPr>
-      </w:pPr>
-    </w:p>
-    <w:p>
-      <w:r>
+    <w:p/>
+    <w:p>
+      <w:pPr>
+        <w:pStyle w:val="51"/>
+        <w:bidi w:val="0"/>
+        <w:rPr>
+          <w:rFonts w:hint="default"/>
+          <w:lang w:val="vi-VN"/>
+        </w:rPr>
+      </w:pPr>
+      <w:r>
+        <w:rPr>
+          <w:rFonts w:hint="default"/>
+          <w:lang w:val="vi-VN"/>
+        </w:rPr>
+        <w:t>Nguyên lý xử lý và lưu trữ dữ liệu băm mật khẩu.</w:t>
+      </w:r>
+    </w:p>
+    <w:p>
+      <w:pPr>
+        <w:rPr>
+          <w:rFonts w:hint="default"/>
+          <w:lang w:val="vi-VN"/>
+        </w:rPr>
+      </w:pPr>
+      <w:r>
+        <w:rPr>
+          <w:rFonts w:hint="default"/>
+          <w:lang w:val="vi-VN"/>
+        </w:rPr>
+        <w:t>Hệ thống SecureHashAuth tuân thủ nguyên tắc một chiều khi xử lý mật khẩu: mật khẩu người dùng nhập (plaintext) chỉ tồn tại trong bộ nhớ của một HTTP request; không ghi log, không lưu cột password trong cơ sở dữ liệu. Giá trị lưu trữ là chuỗi băm (password_hash) do Passlib sinh ra theo định dạng modular crypt, trong đó đã nhúng salt và các tham số (cost, memory, …) của thuật toán được chọn.</w:t>
+      </w:r>
+    </w:p>
+    <w:p>
+      <w:pPr>
+        <w:rPr>
+          <w:rFonts w:hint="default"/>
+          <w:lang w:val="vi-VN"/>
+        </w:rPr>
+      </w:pPr>
+    </w:p>
+    <w:p>
+      <w:pPr>
+        <w:rPr>
+          <w:rFonts w:hint="default"/>
+          <w:lang w:val="vi-VN"/>
+        </w:rPr>
+      </w:pPr>
+      <w:r>
+        <w:rPr>
+          <w:rFonts w:hint="default"/>
+          <w:lang w:val="vi-VN"/>
+        </w:rPr>
+        <w:t>Cột algorithm lưu thêm nhãn nghiệp vụ (bcrypt, scrypt, argon2) phục vụ hiển thị, thống kê thử nghiệm và audit; việc xác minh khi đăng nhập chủ yếu dựa vào nội dung password_hash (Passlib tự nhận dạng scheme từ tiền tố chuỗi)</w:t>
+      </w:r>
+      <w:bookmarkStart w:id="108" w:name="_GoBack"/>
+      <w:bookmarkEnd w:id="108"/>
+      <w:r>
+        <w:rPr>
+          <w:rFonts w:hint="default"/>
+          <w:lang w:val="vi-VN"/>
+        </w:rPr>
+        <w:t>.</w:t>
+      </w:r>
+    </w:p>
+    <w:p>
+      <w:pPr>
+        <w:rPr>
+          <w:rFonts w:hint="default"/>
+          <w:lang w:val="vi-VN"/>
+        </w:rPr>
+      </w:pPr>
+      <w:r>
+        <w:rPr>
+          <w:rFonts w:hint="default"/>
+          <w:lang w:val="vi-VN"/>
+        </w:rPr>
+        <w:t>Với cùng mật khẩu lab và ba thuật toán khác nhau, chuỗi lưu khác nhau hoàn toàn; tiền tố điển hình:</w:t>
+      </w:r>
+    </w:p>
+    <w:tbl>
+      <w:tblPr>
+        <w:tblStyle w:val="25"/>
+        <w:tblW w:w="0" w:type="auto"/>
+        <w:tblInd w:w="0" w:type="dxa"/>
+        <w:tblBorders>
+          <w:top w:val="single" w:color="auto" w:sz="4" w:space="0"/>
+          <w:left w:val="single" w:color="auto" w:sz="4" w:space="0"/>
+          <w:bottom w:val="single" w:color="auto" w:sz="4" w:space="0"/>
+          <w:right w:val="single" w:color="auto" w:sz="4" w:space="0"/>
+          <w:insideH w:val="single" w:color="auto" w:sz="4" w:space="0"/>
+          <w:insideV w:val="single" w:color="auto" w:sz="4" w:space="0"/>
+        </w:tblBorders>
+        <w:tblLayout w:type="autofit"/>
+        <w:tblCellMar>
+          <w:left w:w="108" w:type="dxa"/>
+          <w:right w:w="108" w:type="dxa"/>
+        </w:tblCellMar>
+      </w:tblPr>
+      <w:tblGrid>
+        <w:gridCol w:w="2462"/>
+        <w:gridCol w:w="6826"/>
+      </w:tblGrid>
+      <w:tr>
+        <w:tc>
+          <w:tcPr>
+            <w:tcW w:w="2462" w:type="dxa"/>
+          </w:tcPr>
+          <w:p>
+            <w:pPr>
+              <w:rPr>
+                <w:rFonts w:hint="default"/>
+                <w:vertAlign w:val="baseline"/>
+                <w:lang w:val="vi-VN"/>
+              </w:rPr>
+            </w:pPr>
+            <w:r>
+              <w:rPr>
+                <w:rFonts w:hint="default"/>
+                <w:vertAlign w:val="baseline"/>
+                <w:lang w:val="vi-VN"/>
+              </w:rPr>
+              <w:t>Thuật toán</w:t>
+            </w:r>
+          </w:p>
+        </w:tc>
+        <w:tc>
+          <w:tcPr>
+            <w:tcW w:w="6826" w:type="dxa"/>
+          </w:tcPr>
+          <w:p>
+            <w:pPr>
+              <w:rPr>
+                <w:rFonts w:hint="default"/>
+                <w:vertAlign w:val="baseline"/>
+                <w:lang w:val="vi-VN"/>
+              </w:rPr>
+            </w:pPr>
+            <w:r>
+              <w:rPr>
+                <w:rFonts w:hint="default"/>
+                <w:vertAlign w:val="baseline"/>
+                <w:lang w:val="vi-VN"/>
+              </w:rPr>
+              <w:t>Tiền tố / đặc điểm chuỗi</w:t>
+            </w:r>
+          </w:p>
+        </w:tc>
+      </w:tr>
+      <w:tr>
+        <w:tc>
+          <w:tcPr>
+            <w:tcW w:w="2462" w:type="dxa"/>
+          </w:tcPr>
+          <w:p>
+            <w:pPr>
+              <w:rPr>
+                <w:rFonts w:hint="default"/>
+                <w:vertAlign w:val="baseline"/>
+                <w:lang w:val="vi-VN"/>
+              </w:rPr>
+            </w:pPr>
+            <w:r>
+              <w:rPr>
+                <w:rFonts w:hint="default"/>
+                <w:vertAlign w:val="baseline"/>
+                <w:lang w:val="vi-VN"/>
+              </w:rPr>
+              <w:t>Bcrypt</w:t>
+            </w:r>
+          </w:p>
+        </w:tc>
+        <w:tc>
+          <w:tcPr>
+            <w:tcW w:w="6826" w:type="dxa"/>
+          </w:tcPr>
+          <w:p>
+            <w:pPr>
+              <w:rPr>
+                <w:rFonts w:hint="default"/>
+                <w:vertAlign w:val="baseline"/>
+                <w:lang w:val="vi-VN"/>
+              </w:rPr>
+            </w:pPr>
+            <w:r>
+              <w:rPr>
+                <w:rFonts w:hint="default"/>
+                <w:vertAlign w:val="baseline"/>
+                <w:lang w:val="vi-VN"/>
+              </w:rPr>
+              <w:t>$2b$ hoặc $2a$</w:t>
+            </w:r>
+          </w:p>
+        </w:tc>
+      </w:tr>
+      <w:tr>
+        <w:tc>
+          <w:tcPr>
+            <w:tcW w:w="2462" w:type="dxa"/>
+          </w:tcPr>
+          <w:p>
+            <w:pPr>
+              <w:rPr>
+                <w:rFonts w:hint="default"/>
+                <w:vertAlign w:val="baseline"/>
+                <w:lang w:val="vi-VN"/>
+              </w:rPr>
+            </w:pPr>
+            <w:r>
+              <w:rPr>
+                <w:rFonts w:hint="default"/>
+                <w:vertAlign w:val="baseline"/>
+                <w:lang w:val="vi-VN"/>
+              </w:rPr>
+              <w:t>Argon2id</w:t>
+            </w:r>
+          </w:p>
+        </w:tc>
+        <w:tc>
+          <w:tcPr>
+            <w:tcW w:w="6826" w:type="dxa"/>
+          </w:tcPr>
+          <w:p>
+            <w:pPr>
+              <w:rPr>
+                <w:rFonts w:hint="default"/>
+                <w:vertAlign w:val="baseline"/>
+                <w:lang w:val="vi-VN"/>
+              </w:rPr>
+            </w:pPr>
+            <w:r>
+              <w:rPr>
+                <w:rFonts w:hint="default"/>
+                <w:vertAlign w:val="baseline"/>
+                <w:lang w:val="vi-VN"/>
+              </w:rPr>
+              <w:t>$argon2id$</w:t>
+            </w:r>
+          </w:p>
+        </w:tc>
+      </w:tr>
+      <w:tr>
+        <w:tc>
+          <w:tcPr>
+            <w:tcW w:w="2462" w:type="dxa"/>
+          </w:tcPr>
+          <w:p>
+            <w:pPr>
+              <w:rPr>
+                <w:rFonts w:hint="default"/>
+                <w:vertAlign w:val="baseline"/>
+                <w:lang w:val="vi-VN"/>
+              </w:rPr>
+            </w:pPr>
+            <w:r>
+              <w:rPr>
+                <w:rFonts w:hint="default"/>
+                <w:vertAlign w:val="baseline"/>
+                <w:lang w:val="vi-VN"/>
+              </w:rPr>
+              <w:t>Scrypt</w:t>
+            </w:r>
+          </w:p>
+        </w:tc>
+        <w:tc>
+          <w:tcPr>
+            <w:tcW w:w="6826" w:type="dxa"/>
+          </w:tcPr>
+          <w:p>
+            <w:pPr>
+              <w:rPr>
+                <w:rFonts w:hint="default"/>
+                <w:vertAlign w:val="baseline"/>
+                <w:lang w:val="vi-VN"/>
+              </w:rPr>
+            </w:pPr>
+            <w:r>
+              <w:rPr>
+                <w:rFonts w:hint="default"/>
+                <w:vertAlign w:val="baseline"/>
+                <w:lang w:val="vi-VN"/>
+              </w:rPr>
+              <w:t>Chứa scrypt hoặc $scrypt$ (theo Passlib)</w:t>
+            </w:r>
+          </w:p>
+        </w:tc>
+      </w:tr>
+    </w:tbl>
+    <w:p>
+      <w:pPr>
+        <w:rPr>
+          <w:rFonts w:hint="default"/>
+          <w:lang w:val="vi-VN"/>
+        </w:rPr>
+      </w:pPr>
+      <w:r>
+        <w:rPr>
+          <w:rFonts w:hint="default"/>
+          <w:lang w:val="vi-VN"/>
+        </w:rPr>
+        <w:t>Vì sao không tách salt ra cột riêng: Passlib encode salt và tham số vào một chuỗi; hàm verify_password đọc đủ thông tin từ password_hash, giảm rủi ro lệch salt/tham số giữa các cột.</w:t>
+      </w:r>
+    </w:p>
+    <w:p>
+      <w:pPr>
+        <w:rPr>
+          <w:rFonts w:hint="default"/>
+          <w:lang w:val="vi-VN"/>
+        </w:rPr>
+      </w:pPr>
+    </w:p>
+    <w:p>
+      <w:pPr>
+        <w:rPr>
+          <w:rFonts w:hint="default"/>
+          <w:lang w:val="vi-VN"/>
+        </w:rPr>
+      </w:pPr>
+    </w:p>
+    <w:p>
+      <w:bookmarkStart w:id="39" w:name="_Toc1620663690"/>
+      <w:r>
+        <w:rPr>
+          <w:rFonts w:hint="default"/>
+          <w:lang w:val="en-US"/>
+        </w:rPr>
         <w:br w:type="page"/>
       </w:r>
     </w:p>
@@ -14969,7 +15250,6 @@
       <w:pPr>
         <w:pStyle w:val="49"/>
       </w:pPr>
-      <w:bookmarkStart w:id="39" w:name="_Toc1620663690"/>
       <w:r>
         <w:rPr>
           <w:rFonts w:hint="default"/>
@@ -23564,22 +23844,6 @@
                       <a:ln w="6350">
                         <a:noFill/>
                       </a:ln>
-                      <a:extLst>
-                        <a:ext uri="{909E8E84-426E-40DD-AFC4-6F175D3DCCD1}">
-                          <a14:hiddenFill xmlns:a14="http://schemas.microsoft.com/office/drawing/2010/main">
-                            <a:solidFill>
-                              <a:schemeClr val="lt1"/>
-                            </a:solidFill>
-                          </a14:hiddenFill>
-                        </a:ext>
-                        <a:ext uri="{91240B29-F687-4F45-9708-019B960494DF}">
-                          <a14:hiddenLine xmlns:a14="http://schemas.microsoft.com/office/drawing/2010/main" w="6350">
-                            <a:solidFill>
-                              <a:prstClr val="black"/>
-                            </a:solidFill>
-                          </a14:hiddenLine>
-                        </a:ext>
-                      </a:extLst>
                     </wps:spPr>
                     <wps:style>
                       <a:lnRef idx="0">
@@ -23630,7 +23894,7 @@
         </mc:Choice>
         <mc:Fallback>
           <w:pict>
-            <v:shape id="_x0000_s1026" o:spid="_x0000_s1026" o:spt="202" type="#_x0000_t202" style="position:absolute;left:0pt;margin-top:0pt;height:144pt;width:144pt;mso-position-horizontal:right;mso-position-horizontal-relative:margin;mso-wrap-style:none;z-index:251672576;mso-width-relative:page;mso-height-relative:page;" filled="f" stroked="f" coordsize="21600,21600" o:gfxdata="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">
+            <v:shape id="_x0000_s1026" o:spid="_x0000_s1026" o:spt="202" type="#_x0000_t202" style="position:absolute;left:0pt;margin-top:0pt;height:144pt;width:144pt;mso-position-horizontal:right;mso-position-horizontal-relative:margin;mso-wrap-style:none;z-index:251672576;mso-width-relative:page;mso-height-relative:page;" filled="f" stroked="f" coordsize="21600,21600" o:gfxdata="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">
               <v:fill on="f" focussize="0,0"/>
               <v:stroke on="f" weight="0.5pt"/>
               <v:imagedata o:title=""/>
@@ -26379,7 +26643,7 @@
 </file>
 
 <file path=customXml/item2.xml><?xml version="1.0" encoding="utf-8"?>
-<b:Sources xmlns:b="http://schemas.openxmlformats.org/officeDocument/2006/bibliography" xmlns="http://schemas.openxmlformats.org/officeDocument/2006/bibliography" SelectedStyle="\APASixthEditionOfficeOnline.xsl" Version="6" StyleName="APA"/>
+<b:Sources xmlns="http://schemas.openxmlformats.org/officeDocument/2006/bibliography" xmlns:b="http://schemas.openxmlformats.org/officeDocument/2006/bibliography" Version="6" SelectedStyle="\APASixthEditionOfficeOnline.xsl" StyleName="APA"/>
 </file>
 
 <file path=customXml/itemProps1.xml><?xml version="1.0" encoding="utf-8"?>

</xml_diff>